<commit_message>
Add completed human-gold audit and DCash cancellation
</commit_message>
<xml_diff>
--- a/paper/current.docx
+++ b/paper/current.docx
@@ -1686,7 +1686,7 @@
         <w:rPr>
           <w:lang w:val="en-US"/>
         </w:rPr>
-        <w:t xml:space="preserve">The programme also tags each jurisdiction’s development stage from its latest official document (one live deployment, ten pilots, thirteen active and twenty-three paused research programmes), separating decided facts from directional leanings. Human adjudication of the model layers is in progress; the reconciliation layer is deterministic and replayable offline from the released archives. Its direction reinforces the central claim that official CBDC texts overstate decidedness.</w:t>
+        <w:t>The programme also tags each monetary jurisdiction's development stage from the latest official evidence (one live deployment, ten pilots, thirteen active research programmes, twenty-two paused programmes and one cancelled project). The cancelled case is DCash 2.0: in February 2026 the ECCB Monetary Council suspended development in favour of the Fast Payment System and the CARICOM Payments and Settlement System (CAPSS) pilot (ECCB Monetary Council, 2026). ECCU remains in the historical design analysis. Human adjudication of the model layers is in progress; the reconciliation layer is deterministic and replayable offline from the released archives. Its direction reinforces the central claim that official CBDC texts overstate decidedness.</w:t>
       </w:r>
     </w:p>
     <w:p>
@@ -1910,6 +1910,16 @@
     </w:p>
     <w:p>
       <w:pPr>
+        <w:keepLines/>
+        <w:spacing w:after="0" w:line="276" w:lineRule="auto"/>
+        <w:ind w:left="567" w:hanging="567"/>
+      </w:pPr>
+      <w:r>
+        <w:t>Eastern Caribbean Central Bank Monetary Council. (2026, February 13). Communiqué of the 112th Meeting of the Monetary Council of the Eastern Caribbean Central Bank. https://www.eccb-centralbank.org/news/communique-of-the-112th-meeting-of-the-eccb-monetary-council</w:t>
+      </w:r>
+    </w:p>
+    <w:p>
+      <w:pPr>
         <w:spacing w:after="0" w:line="276" w:lineRule="auto"/>
         <w:ind w:left="567" w:hanging="567"/>
         <w:jc w:val="left"/>
@@ -2156,7 +2166,7 @@
           <w:szCs w:val="20"/>
           <w:lang w:val="en-US"/>
         </w:rPr>
-        <w:t xml:space="preserve">Revised version: 17 August 2026 (statistical audit and measurement update; human validation in progress; full audit trail at cbdcdataset.org).</w:t>
+        <w:t>Revised version: 19 August 2026 (statistical audit, measurement update and DCash stage correction; human validation in progress; full audit trail at cbdcdataset.org).</w:t>
       </w:r>
     </w:p>
     <w:p>

</xml_diff>

<commit_message>
Replace full adjudication with sampled human validation
</commit_message>
<xml_diff>
--- a/paper/current.docx
+++ b/paper/current.docx
@@ -306,9 +306,7 @@
         <w:rPr>
           <w:lang w:val="en-US"/>
         </w:rPr>
-        <w:t xml:space="preserve">The central methodological move is to measure privacy in two different ways. The privacy-family share (our vocabulary measure) counts privacy-related language, such as references to anonymity, data protection, confidentiality, and user privacy. The documented privacy posture (our commitment measure) aggregates design choices that determine informational exposure — weighting decisions twice as heavily as proposals — such as whether the architecture supports offline anonymity, whether it incorporates privacy-enhancing technologies or data </w:t>
-        <w:lastRenderedPageBreak/>
-        <w:t xml:space="preserve">minimisation, and, crucially, whether transaction data is withheld from the state or merely from commercial counterparties. A design can speak at length about protecting user privacy while committing to full state visibility of every transaction, so vocabulary and commitment then point in opposite directions. Inter-coder reliability for the multi-dimensional coding scheme is being assessed with Krippendorff’s α on a 15% double-coded sample (Krippendorff, 2019), which is appropriate because the coding spans several dimensions and is not restricted to two coders.</w:t>
+        <w:t>The central methodological move is to measure privacy in two different ways. The privacy-family share (our vocabulary measure) counts privacy-related language, such as references to anonymity, data protection, confidentiality, and user privacy. The documented privacy posture (our commitment measure) aggregates design choices that determine informational exposure — weighting decisions twice as heavily as proposals — such as whether the architecture supports offline anonymity, whether it incorporates privacy-enhancing technologies or data minimisation, and, crucially, whether transaction data is withheld from the state or merely from commercial counterparties. A design can speak at length about protecting user privacy while committing to full state visibility of every transaction, so vocabulary and commitment then point in opposite directions. Candidate validity and inter-coder reliability are being assessed on a pre-frozen blind probability sample of 365 of 6,949 candidates (5.25%; 95% worst-case margin ±4.99 percentage points), independently coded by both authors before disagreement-only consensus. We will report design-weighted acceptance, percent agreement, Krippendorff’s α, and Gwet’s AC1; retrieval recall remains the separately frozen calibration estimate (Krippendorff, 2019).</w:t>
       </w:r>
     </w:p>
     <w:p>
@@ -2166,7 +2164,7 @@
           <w:szCs w:val="20"/>
           <w:lang w:val="en-US"/>
         </w:rPr>
-        <w:t>Revised version: 19 August 2026 (statistical audit, measurement update and DCash stage correction; human validation in progress; full audit trail at cbdcdataset.org).</w:t>
+        <w:t>Revised version: 25 August 2026 (statistical audit, measurement update, DCash stage correction, and pre-frozen sampled human-validation design; validation in progress; full audit trail at cbdcdataset.org).</w:t>
       </w:r>
     </w:p>
     <w:p>

</xml_diff>